<commit_message>
Update AgriTwin conference report
Replace docs/Documents/AgriTwin-GH - Conference Report.docx with a revised binary version containing updated content and formatting (final edits from the conference).
</commit_message>
<xml_diff>
--- a/docs/Documents/AgriTwin-GH - Conference Report.docx
+++ b/docs/Documents/AgriTwin-GH - Conference Report.docx
@@ -2317,6 +2317,7 @@
       <w:r>
         <w:rPr>
           <w:rFonts w:ascii="Aptos" w:eastAsia="Aptos" w:hAnsi="Aptos" w:cs="Aptos"/>
+          <w:noProof/>
         </w:rPr>
         <w:drawing>
           <wp:inline distT="0" distB="0" distL="0" distR="0" wp14:anchorId="30F7B9F0" wp14:editId="51576056">
@@ -2452,13 +2453,13 @@
     <w:tbl>
       <w:tblPr>
         <w:tblStyle w:val="GridTable1Light"/>
-        <w:tblW w:w="0pt" w:type="auto"/>
+        <w:tblW w:w="240.75pt" w:type="dxa"/>
         <w:tblLook w:firstRow="1" w:lastRow="0" w:firstColumn="1" w:lastColumn="0" w:noHBand="0" w:noVBand="1"/>
       </w:tblPr>
       <w:tblGrid>
-        <w:gridCol w:w="1273"/>
-        <w:gridCol w:w="1821"/>
-        <w:gridCol w:w="1762"/>
+        <w:gridCol w:w="1217"/>
+        <w:gridCol w:w="1755"/>
+        <w:gridCol w:w="1843"/>
       </w:tblGrid>
       <w:tr>
         <w:trPr>
@@ -2467,7 +2468,7 @@
         <w:tc>
           <w:tcPr>
             <w:cnfStyle w:firstRow="0" w:lastRow="0" w:firstColumn="1" w:lastColumn="0" w:oddVBand="0" w:evenVBand="0" w:oddHBand="0" w:evenHBand="0" w:firstRowFirstColumn="0" w:firstRowLastColumn="0" w:lastRowFirstColumn="0" w:lastRowLastColumn="0"/>
-            <w:tcW w:w="0pt" w:type="auto"/>
+            <w:tcW w:w="60.85pt" w:type="dxa"/>
             <w:hideMark/>
           </w:tcPr>
           <w:p>
@@ -2490,7 +2491,7 @@
         </w:tc>
         <w:tc>
           <w:tcPr>
-            <w:tcW w:w="0pt" w:type="auto"/>
+            <w:tcW w:w="87.75pt" w:type="dxa"/>
             <w:hideMark/>
           </w:tcPr>
           <w:p>
@@ -2515,13 +2516,13 @@
                 <w:rFonts w:eastAsia="Times New Roman"/>
                 <w:lang w:val="en-IN"/>
               </w:rPr>
-              <w:t xml:space="preserve"> – Random Forest (Best Model)</w:t>
+              <w:t xml:space="preserve"> – Random Forest </w:t>
             </w:r>
           </w:p>
         </w:tc>
         <w:tc>
           <w:tcPr>
-            <w:tcW w:w="0pt" w:type="auto"/>
+            <w:tcW w:w="92.15pt" w:type="dxa"/>
             <w:hideMark/>
           </w:tcPr>
           <w:p>
@@ -2548,7 +2549,7 @@
         <w:tc>
           <w:tcPr>
             <w:cnfStyle w:firstRow="0" w:lastRow="0" w:firstColumn="1" w:lastColumn="0" w:oddVBand="0" w:evenVBand="0" w:oddHBand="0" w:evenHBand="0" w:firstRowFirstColumn="0" w:firstRowLastColumn="0" w:lastRowFirstColumn="0" w:lastRowLastColumn="0"/>
-            <w:tcW w:w="0pt" w:type="auto"/>
+            <w:tcW w:w="60.85pt" w:type="dxa"/>
             <w:hideMark/>
           </w:tcPr>
           <w:p>
@@ -2571,7 +2572,7 @@
         </w:tc>
         <w:tc>
           <w:tcPr>
-            <w:tcW w:w="0pt" w:type="auto"/>
+            <w:tcW w:w="87.75pt" w:type="dxa"/>
             <w:hideMark/>
           </w:tcPr>
           <w:p>
@@ -2595,7 +2596,7 @@
         </w:tc>
         <w:tc>
           <w:tcPr>
-            <w:tcW w:w="0pt" w:type="auto"/>
+            <w:tcW w:w="92.15pt" w:type="dxa"/>
             <w:hideMark/>
           </w:tcPr>
           <w:p>
@@ -2622,7 +2623,7 @@
         <w:tc>
           <w:tcPr>
             <w:cnfStyle w:firstRow="0" w:lastRow="0" w:firstColumn="1" w:lastColumn="0" w:oddVBand="0" w:evenVBand="0" w:oddHBand="0" w:evenHBand="0" w:firstRowFirstColumn="0" w:firstRowLastColumn="0" w:lastRowFirstColumn="0" w:lastRowLastColumn="0"/>
-            <w:tcW w:w="0pt" w:type="auto"/>
+            <w:tcW w:w="60.85pt" w:type="dxa"/>
             <w:hideMark/>
           </w:tcPr>
           <w:p>
@@ -2645,7 +2646,7 @@
         </w:tc>
         <w:tc>
           <w:tcPr>
-            <w:tcW w:w="0pt" w:type="auto"/>
+            <w:tcW w:w="87.75pt" w:type="dxa"/>
             <w:hideMark/>
           </w:tcPr>
           <w:p>
@@ -2669,7 +2670,7 @@
         </w:tc>
         <w:tc>
           <w:tcPr>
-            <w:tcW w:w="0pt" w:type="auto"/>
+            <w:tcW w:w="92.15pt" w:type="dxa"/>
             <w:hideMark/>
           </w:tcPr>
           <w:p>
@@ -2696,7 +2697,7 @@
         <w:tc>
           <w:tcPr>
             <w:cnfStyle w:firstRow="0" w:lastRow="0" w:firstColumn="1" w:lastColumn="0" w:oddVBand="0" w:evenVBand="0" w:oddHBand="0" w:evenHBand="0" w:firstRowFirstColumn="0" w:firstRowLastColumn="0" w:lastRowFirstColumn="0" w:lastRowLastColumn="0"/>
-            <w:tcW w:w="0pt" w:type="auto"/>
+            <w:tcW w:w="60.85pt" w:type="dxa"/>
             <w:hideMark/>
           </w:tcPr>
           <w:p>
@@ -2719,7 +2720,7 @@
         </w:tc>
         <w:tc>
           <w:tcPr>
-            <w:tcW w:w="0pt" w:type="auto"/>
+            <w:tcW w:w="87.75pt" w:type="dxa"/>
             <w:hideMark/>
           </w:tcPr>
           <w:p>
@@ -2743,7 +2744,7 @@
         </w:tc>
         <w:tc>
           <w:tcPr>
-            <w:tcW w:w="0pt" w:type="auto"/>
+            <w:tcW w:w="92.15pt" w:type="dxa"/>
             <w:hideMark/>
           </w:tcPr>
           <w:p>
@@ -2770,7 +2771,7 @@
         <w:tc>
           <w:tcPr>
             <w:cnfStyle w:firstRow="0" w:lastRow="0" w:firstColumn="1" w:lastColumn="0" w:oddVBand="0" w:evenVBand="0" w:oddHBand="0" w:evenHBand="0" w:firstRowFirstColumn="0" w:firstRowLastColumn="0" w:lastRowFirstColumn="0" w:lastRowLastColumn="0"/>
-            <w:tcW w:w="0pt" w:type="auto"/>
+            <w:tcW w:w="60.85pt" w:type="dxa"/>
             <w:hideMark/>
           </w:tcPr>
           <w:p>
@@ -2793,7 +2794,7 @@
         </w:tc>
         <w:tc>
           <w:tcPr>
-            <w:tcW w:w="0pt" w:type="auto"/>
+            <w:tcW w:w="87.75pt" w:type="dxa"/>
             <w:hideMark/>
           </w:tcPr>
           <w:p>
@@ -2817,7 +2818,7 @@
         </w:tc>
         <w:tc>
           <w:tcPr>
-            <w:tcW w:w="0pt" w:type="auto"/>
+            <w:tcW w:w="92.15pt" w:type="dxa"/>
             <w:hideMark/>
           </w:tcPr>
           <w:p>
@@ -2844,7 +2845,7 @@
         <w:tc>
           <w:tcPr>
             <w:cnfStyle w:firstRow="0" w:lastRow="0" w:firstColumn="1" w:lastColumn="0" w:oddVBand="0" w:evenVBand="0" w:oddHBand="0" w:evenHBand="0" w:firstRowFirstColumn="0" w:firstRowLastColumn="0" w:lastRowFirstColumn="0" w:lastRowLastColumn="0"/>
-            <w:tcW w:w="0pt" w:type="auto"/>
+            <w:tcW w:w="60.85pt" w:type="dxa"/>
             <w:hideMark/>
           </w:tcPr>
           <w:p>
@@ -2867,7 +2868,7 @@
         </w:tc>
         <w:tc>
           <w:tcPr>
-            <w:tcW w:w="0pt" w:type="auto"/>
+            <w:tcW w:w="87.75pt" w:type="dxa"/>
             <w:hideMark/>
           </w:tcPr>
           <w:p>
@@ -2891,7 +2892,7 @@
         </w:tc>
         <w:tc>
           <w:tcPr>
-            <w:tcW w:w="0pt" w:type="auto"/>
+            <w:tcW w:w="92.15pt" w:type="dxa"/>
             <w:hideMark/>
           </w:tcPr>
           <w:p>
@@ -2918,7 +2919,7 @@
         <w:tc>
           <w:tcPr>
             <w:cnfStyle w:firstRow="0" w:lastRow="0" w:firstColumn="1" w:lastColumn="0" w:oddVBand="0" w:evenVBand="0" w:oddHBand="0" w:evenHBand="0" w:firstRowFirstColumn="0" w:firstRowLastColumn="0" w:lastRowFirstColumn="0" w:lastRowLastColumn="0"/>
-            <w:tcW w:w="0pt" w:type="auto"/>
+            <w:tcW w:w="60.85pt" w:type="dxa"/>
             <w:hideMark/>
           </w:tcPr>
           <w:p>
@@ -2941,7 +2942,7 @@
         </w:tc>
         <w:tc>
           <w:tcPr>
-            <w:tcW w:w="0pt" w:type="auto"/>
+            <w:tcW w:w="87.75pt" w:type="dxa"/>
             <w:hideMark/>
           </w:tcPr>
           <w:p>
@@ -2965,7 +2966,7 @@
         </w:tc>
         <w:tc>
           <w:tcPr>
-            <w:tcW w:w="0pt" w:type="auto"/>
+            <w:tcW w:w="92.15pt" w:type="dxa"/>
             <w:hideMark/>
           </w:tcPr>
           <w:p>
@@ -2992,7 +2993,7 @@
         <w:tc>
           <w:tcPr>
             <w:cnfStyle w:firstRow="0" w:lastRow="0" w:firstColumn="1" w:lastColumn="0" w:oddVBand="0" w:evenVBand="0" w:oddHBand="0" w:evenHBand="0" w:firstRowFirstColumn="0" w:firstRowLastColumn="0" w:lastRowFirstColumn="0" w:lastRowLastColumn="0"/>
-            <w:tcW w:w="0pt" w:type="auto"/>
+            <w:tcW w:w="60.85pt" w:type="dxa"/>
             <w:hideMark/>
           </w:tcPr>
           <w:p>
@@ -3015,7 +3016,7 @@
         </w:tc>
         <w:tc>
           <w:tcPr>
-            <w:tcW w:w="0pt" w:type="auto"/>
+            <w:tcW w:w="87.75pt" w:type="dxa"/>
             <w:hideMark/>
           </w:tcPr>
           <w:p>
@@ -3039,7 +3040,7 @@
         </w:tc>
         <w:tc>
           <w:tcPr>
-            <w:tcW w:w="0pt" w:type="auto"/>
+            <w:tcW w:w="92.15pt" w:type="dxa"/>
             <w:hideMark/>
           </w:tcPr>
           <w:p>
@@ -3066,7 +3067,7 @@
         <w:tc>
           <w:tcPr>
             <w:cnfStyle w:firstRow="0" w:lastRow="0" w:firstColumn="1" w:lastColumn="0" w:oddVBand="0" w:evenVBand="0" w:oddHBand="0" w:evenHBand="0" w:firstRowFirstColumn="0" w:firstRowLastColumn="0" w:lastRowFirstColumn="0" w:lastRowLastColumn="0"/>
-            <w:tcW w:w="0pt" w:type="auto"/>
+            <w:tcW w:w="60.85pt" w:type="dxa"/>
             <w:hideMark/>
           </w:tcPr>
           <w:p>
@@ -3089,7 +3090,7 @@
         </w:tc>
         <w:tc>
           <w:tcPr>
-            <w:tcW w:w="0pt" w:type="auto"/>
+            <w:tcW w:w="87.75pt" w:type="dxa"/>
             <w:hideMark/>
           </w:tcPr>
           <w:p>
@@ -3113,7 +3114,7 @@
         </w:tc>
         <w:tc>
           <w:tcPr>
-            <w:tcW w:w="0pt" w:type="auto"/>
+            <w:tcW w:w="92.15pt" w:type="dxa"/>
             <w:hideMark/>
           </w:tcPr>
           <w:p>
@@ -3140,7 +3141,7 @@
         <w:tc>
           <w:tcPr>
             <w:cnfStyle w:firstRow="0" w:lastRow="0" w:firstColumn="1" w:lastColumn="0" w:oddVBand="0" w:evenVBand="0" w:oddHBand="0" w:evenHBand="0" w:firstRowFirstColumn="0" w:firstRowLastColumn="0" w:lastRowFirstColumn="0" w:lastRowLastColumn="0"/>
-            <w:tcW w:w="0pt" w:type="auto"/>
+            <w:tcW w:w="60.85pt" w:type="dxa"/>
             <w:hideMark/>
           </w:tcPr>
           <w:p>
@@ -3163,7 +3164,7 @@
         </w:tc>
         <w:tc>
           <w:tcPr>
-            <w:tcW w:w="0pt" w:type="auto"/>
+            <w:tcW w:w="87.75pt" w:type="dxa"/>
             <w:hideMark/>
           </w:tcPr>
           <w:p>
@@ -3187,7 +3188,7 @@
         </w:tc>
         <w:tc>
           <w:tcPr>
-            <w:tcW w:w="0pt" w:type="auto"/>
+            <w:tcW w:w="92.15pt" w:type="dxa"/>
             <w:hideMark/>
           </w:tcPr>
           <w:p>
@@ -3221,7 +3222,7 @@
         <w:tc>
           <w:tcPr>
             <w:cnfStyle w:firstRow="0" w:lastRow="0" w:firstColumn="1" w:lastColumn="0" w:oddVBand="0" w:evenVBand="0" w:oddHBand="0" w:evenHBand="0" w:firstRowFirstColumn="0" w:firstRowLastColumn="0" w:lastRowFirstColumn="0" w:lastRowLastColumn="0"/>
-            <w:tcW w:w="0pt" w:type="auto"/>
+            <w:tcW w:w="60.85pt" w:type="dxa"/>
             <w:hideMark/>
           </w:tcPr>
           <w:p>
@@ -3244,7 +3245,7 @@
         </w:tc>
         <w:tc>
           <w:tcPr>
-            <w:tcW w:w="0pt" w:type="auto"/>
+            <w:tcW w:w="87.75pt" w:type="dxa"/>
             <w:hideMark/>
           </w:tcPr>
           <w:p>
@@ -3268,7 +3269,7 @@
         </w:tc>
         <w:tc>
           <w:tcPr>
-            <w:tcW w:w="0pt" w:type="auto"/>
+            <w:tcW w:w="92.15pt" w:type="dxa"/>
             <w:hideMark/>
           </w:tcPr>
           <w:p>
@@ -3309,7 +3310,7 @@
         <w:tc>
           <w:tcPr>
             <w:cnfStyle w:firstRow="0" w:lastRow="0" w:firstColumn="1" w:lastColumn="0" w:oddVBand="0" w:evenVBand="0" w:oddHBand="0" w:evenHBand="0" w:firstRowFirstColumn="0" w:firstRowLastColumn="0" w:lastRowFirstColumn="0" w:lastRowLastColumn="0"/>
-            <w:tcW w:w="0pt" w:type="auto"/>
+            <w:tcW w:w="60.85pt" w:type="dxa"/>
             <w:hideMark/>
           </w:tcPr>
           <w:p>
@@ -3332,7 +3333,7 @@
         </w:tc>
         <w:tc>
           <w:tcPr>
-            <w:tcW w:w="0pt" w:type="auto"/>
+            <w:tcW w:w="87.75pt" w:type="dxa"/>
             <w:hideMark/>
           </w:tcPr>
           <w:p>
@@ -3356,7 +3357,7 @@
         </w:tc>
         <w:tc>
           <w:tcPr>
-            <w:tcW w:w="0pt" w:type="auto"/>
+            <w:tcW w:w="92.15pt" w:type="dxa"/>
             <w:hideMark/>
           </w:tcPr>
           <w:p>
@@ -3383,7 +3384,7 @@
         <w:tc>
           <w:tcPr>
             <w:cnfStyle w:firstRow="0" w:lastRow="0" w:firstColumn="1" w:lastColumn="0" w:oddVBand="0" w:evenVBand="0" w:oddHBand="0" w:evenHBand="0" w:firstRowFirstColumn="0" w:firstRowLastColumn="0" w:lastRowFirstColumn="0" w:lastRowLastColumn="0"/>
-            <w:tcW w:w="0pt" w:type="auto"/>
+            <w:tcW w:w="60.85pt" w:type="dxa"/>
             <w:hideMark/>
           </w:tcPr>
           <w:p>
@@ -3406,7 +3407,7 @@
         </w:tc>
         <w:tc>
           <w:tcPr>
-            <w:tcW w:w="0pt" w:type="auto"/>
+            <w:tcW w:w="87.75pt" w:type="dxa"/>
             <w:hideMark/>
           </w:tcPr>
           <w:p>
@@ -3430,7 +3431,7 @@
         </w:tc>
         <w:tc>
           <w:tcPr>
-            <w:tcW w:w="0pt" w:type="auto"/>
+            <w:tcW w:w="92.15pt" w:type="dxa"/>
             <w:hideMark/>
           </w:tcPr>
           <w:p>
@@ -6569,6 +6570,7 @@
   <w:style w:type="character" w:default="1" w:styleId="DefaultParagraphFont">
     <w:name w:val="Default Paragraph Font"/>
     <w:uiPriority w:val="1"/>
+    <w:semiHidden/>
     <w:unhideWhenUsed/>
   </w:style>
   <w:style w:type="table" w:default="1" w:styleId="TableNormal">

</xml_diff>

<commit_message>
Update AgriTwin-GH conference report
Replace/modify docs/Documents/AgriTwin-GH - Conference Report.docx. This commit updates the binary .docx conference report file with revised content.
</commit_message>
<xml_diff>
--- a/docs/Documents/AgriTwin-GH - Conference Report.docx
+++ b/docs/Documents/AgriTwin-GH - Conference Report.docx
@@ -1320,7 +1320,19 @@
         <w:rPr>
           <w:rFonts w:eastAsia="Times New Roman"/>
         </w:rPr>
-        <w:t>Digital twin–based simulation and model predictive control.</w:t>
+        <w:t xml:space="preserve">Digital </w:t>
+      </w:r>
+      <w:r>
+        <w:rPr>
+          <w:rFonts w:eastAsia="Times New Roman"/>
+        </w:rPr>
+        <w:t>T</w:t>
+      </w:r>
+      <w:r>
+        <w:rPr>
+          <w:rFonts w:eastAsia="Times New Roman"/>
+        </w:rPr>
+        <w:t>win and model predictive control.</w:t>
       </w:r>
     </w:p>
     <w:p>
@@ -1539,7 +1551,13 @@
         <w:rPr>
           <w:rFonts w:eastAsia="Times New Roman"/>
         </w:rPr>
-        <w:t>Time-series alignment, ensuring temporal synchronization across multiple environmental variables such as temperature, humidity, CO₂ concentration, soil moisture, electrical conductivity, and pH.</w:t>
+        <w:t>Temporal data synchronization is performed to maintain consistent alignment among various environmental parameters, including air temperature, relative humidity, carbon dioxide levels, soil moisture content, electrical conductivity, and pH values</w:t>
+      </w:r>
+      <w:r>
+        <w:rPr>
+          <w:rFonts w:eastAsia="Times New Roman"/>
+        </w:rPr>
+        <w:t>.</w:t>
       </w:r>
     </w:p>
     <w:p>
@@ -1640,7 +1658,13 @@
         <w:rPr>
           <w:rFonts w:eastAsia="Times New Roman"/>
         </w:rPr>
-        <w:t xml:space="preserve"> the Predictive Analytics and Classification module transforms standardized data streams into high-level crop intelligence using a combination of machine learning and deep learning techniques.</w:t>
+        <w:t xml:space="preserve"> the </w:t>
+      </w:r>
+      <w:r>
+        <w:rPr>
+          <w:rFonts w:eastAsia="Times New Roman"/>
+        </w:rPr>
+        <w:t>Predictive Analytics and Classification module converts preprocessed and normalized data inputs into actionable crop insights by leveraging both traditional machine learning methods and advanced deep learning models.</w:t>
       </w:r>
     </w:p>
     <w:p>
@@ -1715,7 +1739,13 @@
         <w:rPr>
           <w:rFonts w:eastAsia="Times New Roman"/>
         </w:rPr>
-        <w:t>Feature fusion techniques integrate environmental sensor data with image-derived visual features, enabling a comprehensive assessment of greenhouse conditions. The module supports multiple predictive tasks:</w:t>
+        <w:t>Integrated data processing approaches combine real-time environmental sensor readings with visual features extracted from plant images, allowing the system to generate a more holistic and context-aware evaluation of greenhouse conditions.</w:t>
+      </w:r>
+      <w:r>
+        <w:rPr>
+          <w:rFonts w:eastAsia="Times New Roman"/>
+        </w:rPr>
+        <w:t xml:space="preserve"> The module supports multiple predictive tasks:</w:t>
       </w:r>
     </w:p>
     <w:p>
@@ -1754,16 +1784,16 @@
         <w:rPr>
           <w:rFonts w:eastAsia="Times New Roman"/>
         </w:rPr>
+        <w:t xml:space="preserve"> • Growth stage classification, identifying vegetative, flowering, fruiting, and harvest-ready stages using visual and temporal patterns.</w:t>
+      </w:r>
+      <w:r>
+        <w:br/>
+      </w:r>
+      <w:r>
+        <w:rPr>
+          <w:rFonts w:eastAsia="Times New Roman"/>
+        </w:rPr>
         <w:lastRenderedPageBreak/>
-        <w:t xml:space="preserve"> • Growth stage classification, identifying vegetative, flowering, fruiting, and harvest-ready stages using visual and temporal patterns.</w:t>
-      </w:r>
-      <w:r>
-        <w:br/>
-      </w:r>
-      <w:r>
-        <w:rPr>
-          <w:rFonts w:eastAsia="Times New Roman"/>
-        </w:rPr>
         <w:t xml:space="preserve"> • Temporal risk prediction, forecasting short-term future risks based on historical trends and environmental dynamics.</w:t>
       </w:r>
     </w:p>
@@ -1803,13 +1833,43 @@
         <w:jc w:val="both"/>
         <w:rPr>
           <w:rFonts w:eastAsia="Times New Roman"/>
-        </w:rPr>
-      </w:pPr>
-      <w:r>
-        <w:rPr>
-          <w:rFonts w:eastAsia="Times New Roman"/>
-        </w:rPr>
-        <w:t>Disease Detection: Convolutional Neural Networks (CNNs) are used for image-based disease classification due to their ability to extract hierarchical spatial features such as textures and lesion patterns. CNN models are trained on labeled tomato and strawberry leaf images to detect diseases like powdery mildew and leaf mold. Instead of binary labels, the network produces probabilistic confidence scores, enabling early risk estimation. These predictions are correlated with environmental data to improve robustness.</w:t>
+          <w:lang w:val="en-IN"/>
+        </w:rPr>
+      </w:pPr>
+      <w:r>
+        <w:rPr>
+          <w:rFonts w:eastAsia="Times New Roman"/>
+          <w:lang w:val="en-IN"/>
+        </w:rPr>
+        <w:t>Disease Detection:</w:t>
+      </w:r>
+      <w:r>
+        <w:rPr>
+          <w:rFonts w:eastAsia="Times New Roman"/>
+          <w:lang w:val="en-IN"/>
+        </w:rPr>
+        <w:t xml:space="preserve"> </w:t>
+      </w:r>
+      <w:r>
+        <w:rPr>
+          <w:rFonts w:eastAsia="Times New Roman"/>
+          <w:lang w:val="en-IN"/>
+        </w:rPr>
+        <w:t>Image-driven disease identification in the system is performed using deep learning techniques, specifically Convolutional Neural Networks. These networks are well suited for visual analysis because they automatically learn layered feature representations from raw leaf images, capturing visual characteristics such as surface texture variations, discoloration regions, and abnormal lesion formations.</w:t>
+      </w:r>
+      <w:r>
+        <w:rPr>
+          <w:rFonts w:eastAsia="Times New Roman"/>
+          <w:lang w:val="en-IN"/>
+        </w:rPr>
+        <w:t xml:space="preserve"> </w:t>
+      </w:r>
+      <w:r>
+        <w:rPr>
+          <w:rFonts w:eastAsia="Times New Roman"/>
+          <w:lang w:val="en-IN"/>
+        </w:rPr>
+        <w:t>The model is trained using annotated datasets of tomato and strawberry leaves to recognize conditions including powdery mildew and leaf mold. Rather than providing simple yes/no outputs, the classifier generates probability-based confidence values for each disease category. This probabilistic output supports early-stage risk assessment instead of late-stage confirmation. To enhance prediction reliability, the visual results are further interpreted alongside environmental parameters such as temperature and humidity, enabling more context-aware and stable disease inference.</w:t>
       </w:r>
     </w:p>
     <w:p>
@@ -1854,7 +1914,13 @@
         <w:rPr>
           <w:rFonts w:eastAsia="Times New Roman"/>
         </w:rPr>
-        <w:t>Feature Fusion Strategy: Feature fusion integrates environmental and image-derived features into a unified representation prior to classification and prediction. This approach improves predictive accuracy by linking visual symptoms with underlying climatic causes, enhancing the reliability of intelligence signals forwarded to the digital twin.</w:t>
+        <w:t xml:space="preserve">Feature Fusion Strategy: Feature fusion integrates environmental and image-derived features into a unified representation prior to classification and prediction. </w:t>
+      </w:r>
+      <w:r>
+        <w:rPr>
+          <w:rFonts w:eastAsia="Times New Roman"/>
+        </w:rPr>
+        <w:t>This strategy strengthens prediction performance by associating observable plant symptoms with corresponding environmental factors, thereby increasing the credibility and robustness of the analytical outputs transmitted to the digital twin system.</w:t>
       </w:r>
     </w:p>
     <w:p>
@@ -1873,22 +1939,28 @@
           <w:b/>
           <w:bCs/>
         </w:rPr>
-        <w:t>Digital Twin–Driven Simulation and Model Predictive Control</w:t>
-      </w:r>
-    </w:p>
-    <w:p>
-      <w:pPr>
-        <w:spacing w:after="8pt" w:line="13.80pt" w:lineRule="auto"/>
-        <w:jc w:val="both"/>
-        <w:rPr>
-          <w:rFonts w:eastAsia="Times New Roman"/>
-        </w:rPr>
-      </w:pPr>
-      <w:r>
-        <w:rPr>
-          <w:rFonts w:eastAsia="Times New Roman"/>
-        </w:rPr>
-        <w:t>The third stage of the methodology implements a software-based digital twin coupled with Model Predictive Control (MPC), as illustrated in Fig. 4. This module represents a virtual replica of the greenhouse system constructed using learned system dynamics and historical data patterns</w:t>
+        <w:t>Digital Twin and Model Predictive Control</w:t>
+      </w:r>
+    </w:p>
+    <w:p>
+      <w:pPr>
+        <w:spacing w:after="8pt" w:line="13.80pt" w:lineRule="auto"/>
+        <w:jc w:val="both"/>
+        <w:rPr>
+          <w:rFonts w:eastAsia="Times New Roman"/>
+        </w:rPr>
+      </w:pPr>
+      <w:r>
+        <w:rPr>
+          <w:rFonts w:eastAsia="Times New Roman"/>
+        </w:rPr>
+        <w:t xml:space="preserve">The third stage of the methodology implements a software-based digital twin coupled with Model Predictive Control (MPC), as illustrated in Fig. 4. This module represents a </w:t>
+      </w:r>
+      <w:r>
+        <w:rPr>
+          <w:rFonts w:eastAsia="Times New Roman"/>
+        </w:rPr>
+        <w:t>virtual replica of the greenhouse system constructed using learned system dynamics and historical data patterns</w:t>
       </w:r>
       <w:r>
         <w:rPr>
@@ -2068,28 +2140,32 @@
         <w:jc w:val="both"/>
         <w:rPr>
           <w:rFonts w:eastAsia="Times New Roman"/>
-        </w:rPr>
-      </w:pPr>
-      <w:r>
-        <w:rPr>
-          <w:rFonts w:eastAsia="Times New Roman"/>
-        </w:rPr>
-        <w:t>Model Predictive Control (MPC) Algorithm:</w:t>
-      </w:r>
-      <w:r>
-        <w:rPr>
-          <w:rFonts w:eastAsia="Times New Roman"/>
-        </w:rPr>
-        <w:t xml:space="preserve"> Model Predictive Control is an optimization-based algorithm that predicts future system states over a finite horizon, evaluates candidate control actions using an objective function, and applies the optimal action in a receding horizon manner.</w:t>
-      </w:r>
-      <w:r>
-        <w:br/>
-      </w:r>
-      <w:r>
-        <w:rPr>
-          <w:rFonts w:eastAsia="Times New Roman"/>
-        </w:rPr>
-        <w:t xml:space="preserve"> The MPC algorithm operates on the digital twin to optimize greenhouse control actions such as irrigation scheduling, ventilation adjustment, lighting regulation, humidity control, and temperature management. The optimization objective balances crop safety, disease risk reduction, and resource efficiency while enforcing agronomic constraints. Control decisions are validated through simulation before being issued as optimized control recommendations.</w:t>
+          <w:lang w:val="en-IN"/>
+        </w:rPr>
+      </w:pPr>
+      <w:r>
+        <w:rPr>
+          <w:rFonts w:eastAsia="Times New Roman"/>
+          <w:lang w:val="en-IN"/>
+        </w:rPr>
+        <w:t>Model Predictive Control is a control strategy grounded in real-time optimization. It estimates the future behavior of a system within a defined prediction window, analyzes multiple possible control inputs using a predefined cost function, and selects the most suitable action at each step using a rolling horizon approach.</w:t>
+      </w:r>
+    </w:p>
+    <w:p>
+      <w:pPr>
+        <w:spacing w:after="8pt" w:line="13.80pt" w:lineRule="auto"/>
+        <w:jc w:val="both"/>
+        <w:rPr>
+          <w:rFonts w:eastAsia="Times New Roman"/>
+          <w:lang w:val="en-IN"/>
+        </w:rPr>
+      </w:pPr>
+      <w:r>
+        <w:rPr>
+          <w:rFonts w:eastAsia="Times New Roman"/>
+          <w:lang w:val="en-IN"/>
+        </w:rPr>
+        <w:t>Within the digital twin framework, the MPC module determines optimal greenhouse operational settings, including irrigation timing, ventilation control, lighting intensity, humidity regulation, and temperature stabilization. The objective function is designed to maintain plant health, minimize disease susceptibility, and enhance efficient utilization of water and energy resources, while strictly adhering to agronomic and safety constraints. Before implementation, proposed control actions are evaluated through virtual simulation to ensure their effectiveness and stability, after which the refined decisions are deployed as optimized control directives.</w:t>
       </w:r>
     </w:p>
     <w:p>
@@ -2123,7 +2199,14 @@
         <w:rPr>
           <w:rFonts w:eastAsia="Times New Roman"/>
         </w:rPr>
-        <w:t>The final methodological outcome is a closed-loop, predictive decision-support mechanism that continuously senses, predicts, simulates, and optimizes greenhouse operations. Instead of direct actuator deployment, the system generates interpretable decision signals, such as crop health indicators, disease risk alerts, growth stage identification, and harvest readiness signals.</w:t>
+        <w:t xml:space="preserve">The final methodological outcome is a closed-loop, predictive decision-support mechanism that continuously </w:t>
+      </w:r>
+      <w:r>
+        <w:rPr>
+          <w:rFonts w:eastAsia="Times New Roman"/>
+        </w:rPr>
+        <w:lastRenderedPageBreak/>
+        <w:t>senses, predicts, simulates, and optimizes greenhouse operations. Instead of direct actuator deployment, the system generates interpretable decision signals, such as crop health indicators, disease risk alerts, growth stage identification, and harvest readiness signals.</w:t>
       </w:r>
       <w:r>
         <w:rPr>
@@ -2150,14 +2233,7 @@
         <w:rPr>
           <w:rFonts w:eastAsia="Times New Roman"/>
         </w:rPr>
-        <w:t xml:space="preserve">By integrating unified data processing, AI-based predictive analytics, and digital twin–driven MPC into a single coherent framework, the proposed methodology advances beyond conventional greenhouse monitoring systems. It enables </w:t>
-      </w:r>
-      <w:r>
-        <w:rPr>
-          <w:rFonts w:eastAsia="Times New Roman"/>
-        </w:rPr>
-        <w:lastRenderedPageBreak/>
-        <w:t>proactive, simulation-validated decision-making, early risk awareness, and intelligent resource optimization, thereby establishing a robust foundation for precision greenhouse horticulture.</w:t>
+        <w:t>By integrating unified data processing, AI-based predictive analytics, and digital twin–driven MPC into a single coherent framework, the proposed methodology advances beyond conventional greenhouse monitoring systems. It enables proactive, simulation-validated decision-making, early risk awareness, and intelligent resource optimization, thereby establishing a robust foundation for precision greenhouse horticulture.</w:t>
       </w:r>
     </w:p>
     <w:p>
@@ -2298,13 +2374,7 @@
         <w:rPr>
           <w:rFonts w:eastAsia="Times New Roman"/>
         </w:rPr>
-        <w:t xml:space="preserve">Building on the baseline visibility, Fig. 8 reports the disease intelligence layer introduced in AgriTwin-GH through a risk indexing mechanism derived from environmental exposure patterns. Fig. 8(A) shows a unified Disease Risk Index, where the index remains mostly within the safe-to-moderate region and is interpreted in relation to medium/high thresholds and </w:t>
-      </w:r>
-      <w:r>
-        <w:rPr>
-          <w:rFonts w:eastAsia="Times New Roman"/>
-        </w:rPr>
-        <w:t>highlighted critical zones. Fig. 8(B) further decomposes the unified index into disease-specific risk scores (e.g., leaf mold and spider mites), demonstrating that the system does not treat “disease risk” as a single generic alarm; instead, it separates risk signatures that arise under different environmental conditions. Finally, Fig. 8(C) summarizes cumulative high-humidity exposure (risk budget), which captures duration-based stress rather than instantaneous spikes alone. This is important for greenhouse pathology because sustained exposure windows are often more informative than single-point threshold crossings. In comparison terms, the existing monitoring-style approach in Fig. 7 can reveal “what happened” (humidity crossing a line), whereas Fig. 8 provides structured evidence of why it matters (risk accumulation) and what it implies (disease-specific risk characterization), which becomes directly actionable for control decisions.</w:t>
+        <w:t>Building on the baseline visibility, Fig. 8 reports the disease intelligence layer introduced in AgriTwin-GH through a risk indexing mechanism derived from environmental exposure patterns. Fig. 8(A) shows a unified Disease Risk Index, where the index remains mostly within the safe-to-moderate region and is interpreted in relation to medium/high thresholds and highlighted critical zones. Fig. 8(B) further decomposes the unified index into disease-specific risk scores (e.g., leaf mold and spider mites), demonstrating that the system does not treat “disease risk” as a single generic alarm; instead, it separates risk signatures that arise under different environmental conditions. Finally, Fig. 8(C) summarizes cumulative high-humidity exposure (risk budget), which captures duration-based stress rather than instantaneous spikes alone. This is important for greenhouse pathology because sustained exposure windows are often more informative than single-point threshold crossings. In comparison terms, the existing monitoring-style approach in Fig. 7 can reveal “what happened” (humidity crossing a line), whereas Fig. 8 provides structured evidence of why it matters (risk accumulation) and what it implies (disease-specific risk characterization), which becomes directly actionable for control decisions.</w:t>
       </w:r>
     </w:p>
     <w:p>
@@ -2374,7 +2444,14 @@
         <w:rPr>
           <w:rFonts w:eastAsia="Times New Roman"/>
         </w:rPr>
-        <w:t>Fig. 9 presents the core outcome comparison that distinguishes AgriTwin-GH from baseline systems: controlled vs. uncontrolled greenhouse management over a representative 7-day period. Fig. 9(A) shows that closed-loop control produces a tighter temperature trajectory compared with the uncontrolled case, indicating improved setpoint tracking and reduced drift. Fig. 9(B) similarly demonstrates humidity regulation relative to the marked critical threshold, where the controlled profile remains more consistently within the safe operating band. Fig. 9(C) links these improvements to the intended objective by showing disease risk reduction under control, where the controlled risk curve stays suppressed relative to the uncontrolled curve and avoids risk excursions. Fig. 9(D) complements the climate and risk results by showing soil moisture behavior with irrigation control, illustrating how actuato</w:t>
+        <w:t xml:space="preserve">Fig. 9 presents the core outcome comparison that distinguishes AgriTwin-GH from baseline systems: </w:t>
+      </w:r>
+      <w:r>
+        <w:rPr>
+          <w:rFonts w:eastAsia="Times New Roman"/>
+        </w:rPr>
+        <w:lastRenderedPageBreak/>
+        <w:t>controlled vs. uncontrolled greenhouse management over a representative 7-day period. Fig. 9(A) shows that closed-loop control produces a tighter temperature trajectory compared with the uncontrolled case, indicating improved setpoint tracking and reduced drift. Fig. 9(B) similarly demonstrates humidity regulation relative to the marked critical threshold, where the controlled profile remains more consistently within the safe operating band. Fig. 9(C) links these improvements to the intended objective by showing disease risk reduction under control, where the controlled risk curve stays suppressed relative to the uncontrolled curve and avoids risk excursions. Fig. 9(D) complements the climate and risk results by showing soil moisture behavior with irrigation control, illustrating how actuato</w:t>
       </w:r>
       <w:r>
         <w:rPr>
@@ -2386,14 +2463,7 @@
         <w:rPr>
           <w:rFonts w:eastAsia="Times New Roman"/>
         </w:rPr>
-        <w:t xml:space="preserve">logic stabilizes moisture around an operational trigger threshold instead of allowing wide depletion/recovery swings. Overall, this figure provides a direct, report-ready comparison: baseline monitoring can only display deviations, while AgriTwin-GH demonstrates measurable improvement in stability and risk containment </w:t>
-      </w:r>
-      <w:r>
-        <w:rPr>
-          <w:rFonts w:eastAsia="Times New Roman"/>
-        </w:rPr>
-        <w:lastRenderedPageBreak/>
-        <w:t>through a digital-twin-informed control policy, which is the key requirement for a meaningful “system outcome” beyond visualization.</w:t>
+        <w:t>logic stabilizes moisture around an operational trigger threshold instead of allowing wide depletion/recovery swings. Overall, this figure provides a direct, report-ready comparison: baseline monitoring can only display deviations, while AgriTwin-GH demonstrates measurable improvement in stability and risk containment through a digital-twin-informed control policy, which is the key requirement for a meaningful “system outcome” beyond visualization.</w:t>
       </w:r>
     </w:p>
     <w:p>
@@ -3525,6 +3595,7 @@
           <w:b/>
           <w:bCs/>
         </w:rPr>
+        <w:lastRenderedPageBreak/>
         <w:t>CONCLUSION AND FUTURE SCOPE</w:t>
       </w:r>
     </w:p>
@@ -3576,14 +3647,7 @@
         <w:rPr>
           <w:rFonts w:eastAsia="Times New Roman"/>
         </w:rPr>
-        <w:t xml:space="preserve">A key contribution is the sensor-independent digital twin paradigm, where open-source datasets function as virtual sensor streams. This reduces infrastructure dependency while </w:t>
-      </w:r>
-      <w:r>
-        <w:rPr>
-          <w:rFonts w:eastAsia="Times New Roman"/>
-        </w:rPr>
-        <w:lastRenderedPageBreak/>
-        <w:t>maintaining realistic greenhouse representation. The results confirm that the framework effectively supports climate regulation, irrigation scheduling, and disease risk mitigation. Overall, AgriTwin-GH provides a scalable decision-support system that enhances crop health, optimizes resource use, and reduces operational risk without requiring immediate physical sensor deployment.</w:t>
+        <w:t>A key contribution is the sensor-independent digital twin paradigm, where open-source datasets function as virtual sensor streams. This reduces infrastructure dependency while maintaining realistic greenhouse representation. The results confirm that the framework effectively supports climate regulation, irrigation scheduling, and disease risk mitigation. Overall, AgriTwin-GH provides a scalable decision-support system that enhances crop health, optimizes resource use, and reduces operational risk without requiring immediate physical sensor deployment.</w:t>
       </w:r>
     </w:p>
     <w:p>
@@ -4042,7 +4106,15 @@
           <w:rFonts w:eastAsia="Times New Roman"/>
           <w:lang w:val="en-IN"/>
         </w:rPr>
-        <w:t xml:space="preserve">[13] A. F. Subahi and K. E. Bouazza, “An intelligent IoT-based system design for controlling and monitoring greenhouse temperature,” </w:t>
+        <w:t xml:space="preserve">[13] A. F. Subahi and K. E. Bouazza, “An intelligent IoT-based system design for controlling and monitoring </w:t>
+      </w:r>
+      <w:r>
+        <w:rPr>
+          <w:rFonts w:eastAsia="Times New Roman"/>
+          <w:lang w:val="en-IN"/>
+        </w:rPr>
+        <w:lastRenderedPageBreak/>
+        <w:t xml:space="preserve">greenhouse temperature,” </w:t>
       </w:r>
       <w:r>
         <w:rPr>
@@ -4117,7 +4189,16 @@
           <w:iCs/>
           <w:lang w:val="en-IN"/>
         </w:rPr>
-        <w:t>Proc. 2024 IEEE 30th Int. Symp. Design and Technology in Electronic Packaging (SIITME)</w:t>
+        <w:t xml:space="preserve">Proc. 2024 IEEE 30th Int. Symp. </w:t>
+      </w:r>
+      <w:r>
+        <w:rPr>
+          <w:rFonts w:eastAsia="Times New Roman"/>
+          <w:i/>
+          <w:iCs/>
+          <w:lang w:val="en-IN"/>
+        </w:rPr>
+        <w:t>Design and Technology in Electronic Packaging (SIITME)</w:t>
       </w:r>
       <w:r>
         <w:rPr>
@@ -4204,7 +4285,6 @@
           <w:rPr>
             <w:noProof/>
           </w:rPr>
-          <w:lastRenderedPageBreak/>
           <w:drawing>
             <wp:anchor distT="0" distB="0" distL="114300" distR="114300" simplePos="0" relativeHeight="251658240" behindDoc="1" locked="0" layoutInCell="1" allowOverlap="1" wp14:anchorId="50A5432F" wp14:editId="6F0F41D4">
               <wp:simplePos x="0" y="0"/>
@@ -6570,7 +6650,6 @@
   <w:style w:type="character" w:default="1" w:styleId="DefaultParagraphFont">
     <w:name w:val="Default Paragraph Font"/>
     <w:uiPriority w:val="1"/>
-    <w:semiHidden/>
     <w:unhideWhenUsed/>
   </w:style>
   <w:style w:type="table" w:default="1" w:styleId="TableNormal">

</xml_diff>